<commit_message>
Redo drivers with real HCS v5 harvest probability: mapped LSOG sits on HIGH harvest-prob ground (reverses slope-proxy); update Fig S5 + Sec 9 + email
</commit_message>
<xml_diff>
--- a/Ecosphere_Comment_Hagan_SupportingInfo.docx
+++ b/Ecosphere_Comment_Hagan_SupportingInfo.docx
@@ -18901,7 +18901,7 @@
         <w:pStyle w:val="Heading1"/>
       </w:pPr>
       <w:r>
-        <w:t xml:space="preserve">Figure S5. Why LSOG is where it is: terrain and disturbance</w:t>
+        <w:t xml:space="preserve">Figure S5. Where LSOG sits relative to modeled harvest probability</w:t>
       </w:r>
     </w:p>
     <w:p>
@@ -18912,7 +18912,7 @@
       <w:r>
         <w:drawing>
           <wp:inline distT="0" distB="0" distL="0" distR="0">
-            <wp:extent cx="4457700" cy="2476500"/>
+            <wp:extent cx="4457700" cy="2352675"/>
             <wp:effectExtent t="0" r="0" b="0" l="0"/>
             <wp:docPr id="1" name="drv" descr="drv" title="drv"/>
             <wp:cNvGraphicFramePr>
@@ -18937,7 +18937,7 @@
                   <pic:spPr bwMode="auto">
                     <a:xfrm>
                       <a:off x="0" y="0"/>
-                      <a:ext cx="4457700" cy="2476500"/>
+                      <a:ext cx="4457700" cy="2352675"/>
                     </a:xfrm>
                     <a:prstGeom prst="rect">
                       <a:avLst/>
@@ -18962,7 +18962,7 @@
           <w:sz w:val="18"/>
           <w:szCs w:val="18"/>
         </w:rPr>
-        <w:t xml:space="preserve">Figure S5. Distributions of (a) modeled disturbance probability and (b) slope (degrees, an accessibility proxy) for LSOG versus non-LSOG pixels over the Maine AOI (n = 3.8 million). LSOG concentrates on steeper, less accessible, more disturbance-prone ground; the LSOG share rises from 12% to 37% across slope terciles and from 17% to 35% across disturbance terciles. Aaron's CONUS harvest-probability model does not cover the Maine unorganized townships, so slope stands in for harvestability.</w:t>
+        <w:t xml:space="preserve">Figure S5. (a) Annual harvest probability (HCS v5 CONUS model: clearcut plus partial) for mapped-LSOG versus non-LSOG pixels over the Maine AOI (n = 3.8 million), and (b) the mapped-LSOG share by harvest-probability tercile. Contrary to a simple accessibility intuition, mapped LSOG sits where modeled harvest probability is highest: the LSOG share rises from 13% in the lowest harvest-probability tercile to 34% in the highest, and LSOG pixels carry higher mean annual harvest probability (0.024 versus 0.021) and disturbance probability (0.128 versus 0.111) than non-LSOG. The likely mechanism is that the structure that reads as LSOG (large trees, high stocking) is also what makes a stand merchantable, so the mapped resource is not shielded by low harvest pressure.</w:t>
       </w:r>
     </w:p>
     <w:p>

</xml_diff>

<commit_message>
Drivers nuance: keep slope (cost/logistics) alongside HCS; merchantable-but-constrained; add pre-emptive-harvest unintended consequence; Fig S5 3-panel
</commit_message>
<xml_diff>
--- a/Ecosphere_Comment_Hagan_SupportingInfo.docx
+++ b/Ecosphere_Comment_Hagan_SupportingInfo.docx
@@ -18901,7 +18901,7 @@
         <w:pStyle w:val="Heading1"/>
       </w:pPr>
       <w:r>
-        <w:t xml:space="preserve">Figure S5. Where LSOG sits relative to modeled harvest probability</w:t>
+        <w:t xml:space="preserve">Figure S5. Where LSOG sits: harvest probability, terrain, and disturbance</w:t>
       </w:r>
     </w:p>
     <w:p>
@@ -18912,7 +18912,7 @@
       <w:r>
         <w:drawing>
           <wp:inline distT="0" distB="0" distL="0" distR="0">
-            <wp:extent cx="4457700" cy="2352675"/>
+            <wp:extent cx="4457700" cy="1809750"/>
             <wp:effectExtent t="0" r="0" b="0" l="0"/>
             <wp:docPr id="1" name="drv" descr="drv" title="drv"/>
             <wp:cNvGraphicFramePr>
@@ -18937,7 +18937,7 @@
                   <pic:spPr bwMode="auto">
                     <a:xfrm>
                       <a:off x="0" y="0"/>
-                      <a:ext cx="4457700" cy="2352675"/>
+                      <a:ext cx="4457700" cy="1809750"/>
                     </a:xfrm>
                     <a:prstGeom prst="rect">
                       <a:avLst/>
@@ -18962,7 +18962,7 @@
           <w:sz w:val="18"/>
           <w:szCs w:val="18"/>
         </w:rPr>
-        <w:t xml:space="preserve">Figure S5. (a) Annual harvest probability (HCS v5 CONUS model: clearcut plus partial) for mapped-LSOG versus non-LSOG pixels over the Maine AOI (n = 3.8 million), and (b) the mapped-LSOG share by harvest-probability tercile. Contrary to a simple accessibility intuition, mapped LSOG sits where modeled harvest probability is highest: the LSOG share rises from 13% in the lowest harvest-probability tercile to 34% in the highest, and LSOG pixels carry higher mean annual harvest probability (0.024 versus 0.021) and disturbance probability (0.128 versus 0.111) than non-LSOG. The likely mechanism is that the structure that reads as LSOG (large trees, high stocking) is also what makes a stand merchantable, so the mapped resource is not shielded by low harvest pressure.</w:t>
+        <w:t xml:space="preserve">Figure S5. Mapped-LSOG share by tercile of three landscape drivers over the Maine AOI (n = 3.8 million pixels), using the airborne Hagan map as the LSOG layer: (a) modeled annual harvest probability (HCS v5 CONUS, clearcut plus partial), (b) slope (a cost-and-logistics constraint on harvesting), and (c) disturbance probability. Mapped LSOG rises with all three: it is more merchantable (harvest-probability share 13% to 34%) yet on steeper ground (12% to 37%) and in more disturbance-prone settings (17% to 35%). Mean values under LSOG versus non-LSOG: harvest probability 0.024 vs 0.021, slope 5.3 vs 3.0 degrees, disturbance 0.128 vs 0.111. Attractiveness and constraint pull in opposite directions, so harvest risk is heterogeneous rather than uniform.</w:t>
       </w:r>
     </w:p>
     <w:p>

</xml_diff>